<commit_message>
Rivedi 'L'accordatore di moke' secondo la revisione editoriale
Finale ridotto a una sola chiusura (la moka aperta e vuota, il nipote
che accende il fornello e ascolta), ritorno alle moke per scelta dopo
il disgelo con il farmacista che ricompra le capsule, contraddittorio
alla nostalgia (la moka che suonava in due stanze), scena di dubbio di
Anselmo, nipote seminato dal secondo paragrafo, tagliata la battuta sul
sindaco. 5.017 battute.

Co-Authored-By: Claude Fable 5 <noreply@anthropic.com>
Claude-Session: https://claude.ai/code/session_01FUZmtReNihnUGsF6SUL9WL
</commit_message>
<xml_diff>
--- a/concorso/L_accordatore_di_moke.docx
+++ b/concorso/L_accordatore_di_moke.docx
@@ -45,142 +45,142 @@
           <w:sz w:val="24"/>
           <w:szCs w:val="24"/>
         </w:rPr>
-        <w:t xml:space="preserve">Si chiamava Anselmo, quinto della sua stirpe, e ogni ottobre faceva il giro delle case come altrove fanno gli accordatori di pianoforti. Bussava, si sedeva in cucina senza togliersi il cappello, accendeva il fornello e ascoltava. A Torrefonda tutti sapevano ciò che la scienza si ostina a negare: ogni moka ha una voce, e quella voce, col tempo, diventa la voce della casa che la ospita. La moka del fornaio borbottava in tono di fa maggiore, robusta come le sue braccia. Quella delle sorelle Malinverni, zitelle e puntigliose, produceva un gorgoglio a due voci che litigavano fino all'ultima goccia. Quella del sindaco, dicevano i maligni, prometteva molto vapore e poco caffè.</w:t>
-      </w:r>
-    </w:p>
-    <w:p>
-      <w:pPr>
-        <w:spacing w:after="120" w:line="360" w:lineRule="auto"/>
-        <w:ind w:firstLine="425"/>
-        <w:jc w:val="both"/>
-      </w:pPr>
-      <w:r>
-        <w:rPr>
-          <w:rFonts w:ascii="Arial" w:cs="Arial" w:eastAsia="Arial" w:hAnsi="Arial"/>
-          <w:sz w:val="24"/>
-          <w:szCs w:val="24"/>
-        </w:rPr>
-        <w:t xml:space="preserve">Anselmo ascoltava, e dove serviva interveniva: una limatura alla valvola, un mezzo giro alla guarnizione, tre colpetti sul beccuccio con il martelletto di ciliegio ereditato dal bisnonno. Così, ogni mattina alle sei, Torrefonda eseguiva la sua sinfonia. Il paese si svegliava per sezioni, come un'orchestra: prima i contrabbassi delle case dei contadini, poi i violoncelli del vicolo dei sarti, infine gli ottoni squillanti delle famiglie con bambini. Non servivano campane né sveglie. E non serviva nemmeno il telefono: dal rumore del caffè si capiva tutto. Una moka che suonava in minore annunciava un lutto, e le vicine salivano con il rosario e la torta di mele. Una moka che accelerava il ritmo tradiva un fidanzamento in arrivo. Quando nacque la figlia del maestro, la sua vecchia caffettiera fece una cosa mai sentita prima: un trillo. Il dottor Fumagalli, che a Torrefonda passava per uomo di scienza, sosteneva che fossero tutte fantasie; però ogni mattina, prima di aprire l'ambulatorio, apriva la finestra e ascoltava il paese, e dal registro dei borbottii sapeva già chi sarebbe venuto a farsi visitare.</w:t>
-      </w:r>
-    </w:p>
-    <w:p>
-      <w:pPr>
-        <w:spacing w:after="120" w:line="360" w:lineRule="auto"/>
-        <w:ind w:firstLine="425"/>
-        <w:jc w:val="both"/>
-      </w:pPr>
-      <w:r>
-        <w:rPr>
-          <w:rFonts w:ascii="Arial" w:cs="Arial" w:eastAsia="Arial" w:hAnsi="Arial"/>
-          <w:sz w:val="24"/>
-          <w:szCs w:val="24"/>
-        </w:rPr>
-        <w:t xml:space="preserve">Poi, un martedì di primavera, arrivò in paese un furgone color argento. Ne scese un rappresentante con la valigetta, che nel giro di un mese vendette a quasi tutto il paese la Silenziosa 3000: una macchina a capsule, elegante come un soprammobile, che produceva il caffè senza il minimo rumore. «Il silenzio», recitava il dépliant, «è il nuovo lusso.» Il sindaco la definì un passo verso il futuro. Le moke finirono negli sgabuzzini, e Anselmo smise di bussare alle porte.</w:t>
-      </w:r>
-    </w:p>
-    <w:p>
-      <w:pPr>
-        <w:spacing w:after="120" w:line="360" w:lineRule="auto"/>
-        <w:ind w:firstLine="425"/>
-        <w:jc w:val="both"/>
-      </w:pPr>
-      <w:r>
-        <w:rPr>
-          <w:rFonts w:ascii="Arial" w:cs="Arial" w:eastAsia="Arial" w:hAnsi="Arial"/>
-          <w:sz w:val="24"/>
-          <w:szCs w:val="24"/>
-        </w:rPr>
-        <w:t xml:space="preserve">Il primo effetto fu che il fornaio non si svegliò, e Torrefonda scoprì che si può avere fame di pane alle sette del mattino. Il secondo fu più sottile: senza sinfonia, nessuno sapeva più niente di nessuno. Le vicine non salirono dalla vedova Petenghi, perché nessuna moka aveva suonato in minore: il suo dolore rimase suo, dietro la porta chiusa. I fidanzamenti coglievano tutti di sorpresa, il che rovinava il gusto di parlarne prima. Il paese continuava a svegliarsi, certo, ma ognuno per conto proprio, in un silenzio educato che somigliava a quello dei condomini di città, dove si abita a un muro di distanza e a chilometri di lontananza.</w:t>
-      </w:r>
-    </w:p>
-    <w:p>
-      <w:pPr>
-        <w:spacing w:after="120" w:line="360" w:lineRule="auto"/>
-        <w:ind w:firstLine="425"/>
-        <w:jc w:val="both"/>
-      </w:pPr>
-      <w:r>
-        <w:rPr>
-          <w:rFonts w:ascii="Arial" w:cs="Arial" w:eastAsia="Arial" w:hAnsi="Arial"/>
-          <w:sz w:val="24"/>
-          <w:szCs w:val="24"/>
-        </w:rPr>
-        <w:t xml:space="preserve">Anselmo non protestò. Si limitò ad aspettare, come aspettano i vecchi e le montagne.</w:t>
-      </w:r>
-    </w:p>
-    <w:p>
-      <w:pPr>
-        <w:spacing w:after="120" w:line="360" w:lineRule="auto"/>
-        <w:ind w:firstLine="425"/>
-        <w:jc w:val="both"/>
-      </w:pPr>
-      <w:r>
-        <w:rPr>
-          <w:rFonts w:ascii="Arial" w:cs="Arial" w:eastAsia="Arial" w:hAnsi="Arial"/>
-          <w:sz w:val="24"/>
-          <w:szCs w:val="24"/>
-        </w:rPr>
-        <w:t xml:space="preserve">L'inverno seguente arrivò la tormenta che ancora oggi a Torrefonda chiamano la Bianca. Tre giorni di neve, i fili della luce spezzati sotto il ghiaccio, e la Silenziosa 3000 si rivelò per quello che era: un soprammobile, appunto. Fu allora che, una dopo l'altra, le porte del paese si aprirono, e per i sentieri gelati comparve una processione mai vista: uomini e donne con la lanterna in una mano e nell'altra una moka riesumata dagli sgabuzzini, ammaccata, ossidata, muta da mesi. Tutti verso la casa dell'accordatore.</w:t>
-      </w:r>
-    </w:p>
-    <w:p>
-      <w:pPr>
-        <w:spacing w:after="120" w:line="360" w:lineRule="auto"/>
-        <w:ind w:firstLine="425"/>
-        <w:jc w:val="both"/>
-      </w:pPr>
-      <w:r>
-        <w:rPr>
-          <w:rFonts w:ascii="Arial" w:cs="Arial" w:eastAsia="Arial" w:hAnsi="Arial"/>
-          <w:sz w:val="24"/>
-          <w:szCs w:val="24"/>
-        </w:rPr>
-        <w:t xml:space="preserve">Anselmo lavorò l'intera notte, al lume di candela, con il martelletto di ciliegio e la pazienza dei suoi novant'anni. E all'alba del quarto giorno, sopra la neve che azzittiva ogni cosa, Torrefonda tornò a suonare: prima una moka sola, esitante come un oboe che dà il la, poi dieci, poi cento, un borbottio immenso che saliva dai camini e scioglieva i ghiaccioli dalle grondaie. Il fornaio, svegliato in fa maggiore, sfornò il pane più alto della sua carriera; le sorelle Malinverni ripresero a litigare in due voci, e parve a tutti una bellissima notizia. La vedova Petenghi, sentendo la propria cucina cantare di nuovo, pianse: giurò di avere riconosciuto, in quel gorgoglio, qualcosa della voce di suo marito. Nessuno in paese osò darle torto.</w:t>
-      </w:r>
-    </w:p>
-    <w:p>
-      <w:pPr>
-        <w:spacing w:after="120" w:line="360" w:lineRule="auto"/>
-        <w:ind w:firstLine="425"/>
-        <w:jc w:val="both"/>
-      </w:pPr>
-      <w:r>
-        <w:rPr>
-          <w:rFonts w:ascii="Arial" w:cs="Arial" w:eastAsia="Arial" w:hAnsi="Arial"/>
-          <w:sz w:val="24"/>
-          <w:szCs w:val="24"/>
-        </w:rPr>
-        <w:t xml:space="preserve">Fu il giovane nipote, che gli faceva da apprendista, a chiedergli infine il segreto del mestiere. Anselmo aprì una moka e gliela mostrò: dentro non c'era niente. Né corde, né martelletti, né misteri: acqua, metallo e un tubo.</w:t>
-      </w:r>
-    </w:p>
-    <w:p>
-      <w:pPr>
-        <w:spacing w:after="120" w:line="360" w:lineRule="auto"/>
-        <w:ind w:firstLine="425"/>
-        <w:jc w:val="both"/>
-      </w:pPr>
-      <w:r>
-        <w:rPr>
-          <w:rFonts w:ascii="Arial" w:cs="Arial" w:eastAsia="Arial" w:hAnsi="Arial"/>
-          <w:sz w:val="24"/>
-          <w:szCs w:val="24"/>
-        </w:rPr>
-        <w:t xml:space="preserve">«Non si può accordare una moka», disse. «Non c'è nulla da accordare. Io in tutti questi anni ho accordato le orecchie del paese: le ho abituate ad ascoltarsi. Il rumore del caffè, ricordatelo, non è mai stato un rumore. È Torrefonda che ogni mattina si conta, casa per casa, e si dice: ci sono anch'io. Ci sei anche tu.»</w:t>
-      </w:r>
-    </w:p>
-    <w:p>
-      <w:pPr>
-        <w:spacing w:after="120" w:line="360" w:lineRule="auto"/>
-        <w:ind w:firstLine="425"/>
-        <w:jc w:val="both"/>
-      </w:pPr>
-      <w:r>
-        <w:rPr>
-          <w:rFonts w:ascii="Arial" w:cs="Arial" w:eastAsia="Arial" w:hAnsi="Arial"/>
-          <w:sz w:val="24"/>
-          <w:szCs w:val="24"/>
-        </w:rPr>
-        <w:t xml:space="preserve">Il nipote esercita ancora oggi il mestiere, in quel paese che non troverete su nessuna carta. Ma se un mattino, in qualunque città, vi svegliate al borbottio di una moka — la vostra o quella di uno sconosciuto oltre il muro — sappiate che Torrefonda esiste, e che per un momento ci avete abitato anche voi.</w:t>
+        <w:t xml:space="preserve">Si chiamava Anselmo, quinto della sua stirpe, e ogni ottobre faceva il giro delle case con il nipote dietro, che gli portava la cassetta degli attrezzi e imparava a tacere. Bussava, si sedeva in cucina senza togliersi il cappello, accendeva il fornello e ascoltava. A Torrefonda tutti sapevano ciò che la scienza si ostina a negare: ogni moka ha una voce, e quella voce, col tempo, diventa la voce della casa che la ospita. La moka del fornaio borbottava in fa maggiore, robusta come le sue braccia. Quella delle sorelle Malinverni, zitelle e puntigliose, produceva un gorgoglio a due voci che litigavano fino all'ultima goccia. Anselmo ascoltava, e dove serviva interveniva: una limatura alla valvola, un mezzo giro alla guarnizione, tre colpetti sul beccuccio con il martelletto di ciliegio ereditato dal bisnonno.</w:t>
+      </w:r>
+    </w:p>
+    <w:p>
+      <w:pPr>
+        <w:spacing w:after="120" w:line="360" w:lineRule="auto"/>
+        <w:ind w:firstLine="425"/>
+        <w:jc w:val="both"/>
+      </w:pPr>
+      <w:r>
+        <w:rPr>
+          <w:rFonts w:ascii="Arial" w:cs="Arial" w:eastAsia="Arial" w:hAnsi="Arial"/>
+          <w:sz w:val="24"/>
+          <w:szCs w:val="24"/>
+        </w:rPr>
+        <w:t xml:space="preserve">Così, ogni mattina alle sei, Torrefonda eseguiva la sua sinfonia. Il paese si svegliava per sezioni, come un'orchestra: prima i contrabbassi delle case dei contadini, poi i violoncelli del vicolo dei sarti, infine gli ottoni squillanti delle famiglie con bambini. Dal rumore del caffè si capiva tutto: una moka che suonava in minore annunciava un lutto, e le vicine salivano con il rosario e la torta di mele; una che accelerava il ritmo tradiva un fidanzamento in arrivo. Il dottor Fumagalli, che passava per uomo di scienza, sosteneva che fossero tutte fantasie; però ogni mattina, prima di aprire l'ambulatorio, apriva la finestra e ascoltava il paese, e dal registro dei borbottii sapeva già chi sarebbe venuto a farsi visitare.</w:t>
+      </w:r>
+    </w:p>
+    <w:p>
+      <w:pPr>
+        <w:spacing w:after="120" w:line="360" w:lineRule="auto"/>
+        <w:ind w:firstLine="425"/>
+        <w:jc w:val="both"/>
+      </w:pPr>
+      <w:r>
+        <w:rPr>
+          <w:rFonts w:ascii="Arial" w:cs="Arial" w:eastAsia="Arial" w:hAnsi="Arial"/>
+          <w:sz w:val="24"/>
+          <w:szCs w:val="24"/>
+        </w:rPr>
+        <w:t xml:space="preserve">Non tutti, va detto, amavano quella musica. Il farmacista Gerosa, che da un anno non dormiva più accanto alla moglie, aveva una moka che ormai suonava due volte, in due stanze diverse; e il paese lo seppe prima che se lo dicessero loro.</w:t>
+      </w:r>
+    </w:p>
+    <w:p>
+      <w:pPr>
+        <w:spacing w:after="120" w:line="360" w:lineRule="auto"/>
+        <w:ind w:firstLine="425"/>
+        <w:jc w:val="both"/>
+      </w:pPr>
+      <w:r>
+        <w:rPr>
+          <w:rFonts w:ascii="Arial" w:cs="Arial" w:eastAsia="Arial" w:hAnsi="Arial"/>
+          <w:sz w:val="24"/>
+          <w:szCs w:val="24"/>
+        </w:rPr>
+        <w:t xml:space="preserve">Poi, un martedì di primavera, arrivò un furgone color argento. Ne scese un rappresentante con la valigetta, che nel giro di un mese vendette a quasi tutto il paese la Silenziosa 3000: una macchina a capsule che faceva il caffè senza il minimo rumore. «Il silenzio», recitava il dépliant, «è il nuovo lusso.» Il farmacista fu il primo a comprarla, e nessuno ebbe il coraggio di domandargli perché.</w:t>
+      </w:r>
+    </w:p>
+    <w:p>
+      <w:pPr>
+        <w:spacing w:after="120" w:line="360" w:lineRule="auto"/>
+        <w:ind w:firstLine="425"/>
+        <w:jc w:val="both"/>
+      </w:pPr>
+      <w:r>
+        <w:rPr>
+          <w:rFonts w:ascii="Arial" w:cs="Arial" w:eastAsia="Arial" w:hAnsi="Arial"/>
+          <w:sz w:val="24"/>
+          <w:szCs w:val="24"/>
+        </w:rPr>
+        <w:t xml:space="preserve">Il primo effetto fu che il fornaio non si svegliò, e Torrefonda scoprì che si può avere fame di pane alle sette del mattino. Il secondo fu più sottile: senza sinfonia, nessuno sapeva più niente di nessuno. Le vicine non salirono dalla vedova Petenghi, perché nessuna moka aveva suonato in minore: il suo dolore rimase suo, dietro la porta chiusa. Il paese continuava a svegliarsi, ma ognuno per conto proprio, in un silenzio educato che somigliava a quello dei condomini di città, dove si abita a un muro di distanza e a chilometri di lontananza.</w:t>
+      </w:r>
+    </w:p>
+    <w:p>
+      <w:pPr>
+        <w:spacing w:after="120" w:line="360" w:lineRule="auto"/>
+        <w:ind w:firstLine="425"/>
+        <w:jc w:val="both"/>
+      </w:pPr>
+      <w:r>
+        <w:rPr>
+          <w:rFonts w:ascii="Arial" w:cs="Arial" w:eastAsia="Arial" w:hAnsi="Arial"/>
+          <w:sz w:val="24"/>
+          <w:szCs w:val="24"/>
+        </w:rPr>
+        <w:t xml:space="preserve">Anselmo non protestò. Ma una sera il nipote lo trovò al tavolo, davanti a una moka smontata in tutti i suoi pezzi, che li fissava come se li vedesse per la prima volta. «Mi domando», disse il vecchio senza alzare gli occhi, «se in tutti questi anni ho accordato davvero qualcosa, o se ho soltanto fatto rumore anch'io.»</w:t>
+      </w:r>
+    </w:p>
+    <w:p>
+      <w:pPr>
+        <w:spacing w:after="120" w:line="360" w:lineRule="auto"/>
+        <w:ind w:firstLine="425"/>
+        <w:jc w:val="both"/>
+      </w:pPr>
+      <w:r>
+        <w:rPr>
+          <w:rFonts w:ascii="Arial" w:cs="Arial" w:eastAsia="Arial" w:hAnsi="Arial"/>
+          <w:sz w:val="24"/>
+          <w:szCs w:val="24"/>
+        </w:rPr>
+        <w:t xml:space="preserve">L'inverno seguente arrivò la tormenta che ancora oggi chiamano la Bianca. Tre giorni di neve, i fili della luce spezzati sotto il ghiaccio, e la Silenziosa 3000 si rivelò per quello che era: un soprammobile. Una dopo l'altra le porte si aprirono, e per i sentieri gelati comparve una processione mai vista: uomini e donne con la lanterna in una mano e nell'altra una moka riesumata dagli sgabuzzini, ammaccata, ossidata, muta da mesi. Anselmo lavorò l'intera notte al lume di candela, e all'alba del quarto giorno, sopra la neve che azzittiva ogni cosa, Torrefonda tornò a suonare: prima una moka sola, esitante come un oboe che dà il la, poi dieci, poi cento. La vedova Petenghi, sentendo la propria cucina cantare di nuovo, pianse; giurò di avere riconosciuto in quel gorgoglio qualcosa della voce di suo marito, e nessuno osò darle torto.</w:t>
+      </w:r>
+    </w:p>
+    <w:p>
+      <w:pPr>
+        <w:spacing w:after="120" w:line="360" w:lineRule="auto"/>
+        <w:ind w:firstLine="425"/>
+        <w:jc w:val="both"/>
+      </w:pPr>
+      <w:r>
+        <w:rPr>
+          <w:rFonts w:ascii="Arial" w:cs="Arial" w:eastAsia="Arial" w:hAnsi="Arial"/>
+          <w:sz w:val="24"/>
+          <w:szCs w:val="24"/>
+        </w:rPr>
+        <w:t xml:space="preserve">La corrente tornò, e col disgelo tornò anche il furgone color argento. Il rappresentante rimise la valigetta sul tavolo dell'osteria e aspettò. Il farmacista ricomprò le capsule il giorno stesso, e nessuno, di nuovo, gli domandò niente. Qualcun altro lo imitò. Ma la maggior parte delle moke restò sui fornelli: non per la neve, che era ormai sciolta, ma per scelta. Il fornaio disse che il pane gli veniva più alto; le Malinverni, che litigare in due voci era il loro modo di volersi bene.</w:t>
+      </w:r>
+    </w:p>
+    <w:p>
+      <w:pPr>
+        <w:spacing w:after="120" w:line="360" w:lineRule="auto"/>
+        <w:ind w:firstLine="425"/>
+        <w:jc w:val="both"/>
+      </w:pPr>
+      <w:r>
+        <w:rPr>
+          <w:rFonts w:ascii="Arial" w:cs="Arial" w:eastAsia="Arial" w:hAnsi="Arial"/>
+          <w:sz w:val="24"/>
+          <w:szCs w:val="24"/>
+        </w:rPr>
+        <w:t xml:space="preserve">Fu il nipote, quella primavera, a chiedere infine il segreto del mestiere. Anselmo svitò una moka e gliela porse aperta: dentro non c'era niente. Né corde, né martelletti, né misteri: acqua, metallo e un tubo.</w:t>
+      </w:r>
+    </w:p>
+    <w:p>
+      <w:pPr>
+        <w:spacing w:after="120" w:line="360" w:lineRule="auto"/>
+        <w:ind w:firstLine="425"/>
+        <w:jc w:val="both"/>
+      </w:pPr>
+      <w:r>
+        <w:rPr>
+          <w:rFonts w:ascii="Arial" w:cs="Arial" w:eastAsia="Arial" w:hAnsi="Arial"/>
+          <w:sz w:val="24"/>
+          <w:szCs w:val="24"/>
+        </w:rPr>
+        <w:t xml:space="preserve">Il nipote la tenne in mano a lungo, come si tiene una domanda. Poi riempì la caldaia, tre cucchiai rasi, accese il fornello, e stette ad ascoltare.</w:t>
       </w:r>
     </w:p>
     <w:sectPr>

</xml_diff>

<commit_message>
Rifinisci 'L'accordatore di moke': via il cartello, torna la rima
Eliminato 'non per la neve, ma per scelta' (il fornaio e le Malinverni
lo dicono già) e ripristinato 'elegante come un soprammobile' per
recuperare l'eco con la rivelazione della tormenta. 4.994 battute.

Co-Authored-By: Claude Fable 5 <noreply@anthropic.com>
Claude-Session: https://claude.ai/code/session_01FUZmtReNihnUGsF6SUL9WL
</commit_message>
<xml_diff>
--- a/concorso/L_accordatore_di_moke.docx
+++ b/concorso/L_accordatore_di_moke.docx
@@ -90,7 +90,7 @@
           <w:sz w:val="24"/>
           <w:szCs w:val="24"/>
         </w:rPr>
-        <w:t xml:space="preserve">Poi, un martedì di primavera, arrivò un furgone color argento. Ne scese un rappresentante con la valigetta, che nel giro di un mese vendette a quasi tutto il paese la Silenziosa 3000: una macchina a capsule che faceva il caffè senza il minimo rumore. «Il silenzio», recitava il dépliant, «è il nuovo lusso.» Il farmacista fu il primo a comprarla, e nessuno ebbe il coraggio di domandargli perché.</w:t>
+        <w:t xml:space="preserve">Poi, un martedì di primavera, arrivò un furgone color argento. Ne scese un rappresentante con la valigetta, che nel giro di un mese vendette a quasi tutto il paese la Silenziosa 3000: una macchina a capsule, elegante come un soprammobile, che faceva il caffè senza il minimo rumore. «Il silenzio», recitava il dépliant, «è il nuovo lusso.» Il farmacista fu il primo a comprarla, e nessuno ebbe il coraggio di domandargli perché.</w:t>
       </w:r>
     </w:p>
     <w:p>
@@ -150,7 +150,7 @@
           <w:sz w:val="24"/>
           <w:szCs w:val="24"/>
         </w:rPr>
-        <w:t xml:space="preserve">La corrente tornò, e col disgelo tornò anche il furgone color argento. Il rappresentante rimise la valigetta sul tavolo dell'osteria e aspettò. Il farmacista ricomprò le capsule il giorno stesso, e nessuno, di nuovo, gli domandò niente. Qualcun altro lo imitò. Ma la maggior parte delle moke restò sui fornelli: non per la neve, che era ormai sciolta, ma per scelta. Il fornaio disse che il pane gli veniva più alto; le Malinverni, che litigare in due voci era il loro modo di volersi bene.</w:t>
+        <w:t xml:space="preserve">La corrente tornò, e col disgelo tornò anche il furgone color argento. Il rappresentante rimise la valigetta sul tavolo dell'osteria e aspettò. Il farmacista ricomprò le capsule il giorno stesso, e nessuno, di nuovo, gli domandò niente. Qualcun altro lo imitò. Ma la maggior parte delle moke restò sui fornelli. Il fornaio disse che il pane gli veniva più alto; le Malinverni, che litigare in due voci era il loro modo di volersi bene.</w:t>
       </w:r>
     </w:p>
     <w:p>

</xml_diff>